<commit_message>
Add meeting and sprint documentation
</commit_message>
<xml_diff>
--- a/documentation/meetings/Meeting_1_Minutes.docx
+++ b/documentation/meetings/Meeting_1_Minutes.docx
@@ -34,7 +34,7 @@
     </w:p>
     <w:tbl>
       <w:tblPr>
-        <w:tblW w:w="10435" w:type="dxa"/>
+        <w:tblW w:w="10255" w:type="dxa"/>
         <w:tblBorders>
           <w:top w:val="single" w:sz="4" w:space="0" w:color="auto"/>
           <w:left w:val="single" w:sz="4" w:space="0" w:color="auto"/>
@@ -47,19 +47,16 @@
           <w:left w:w="10" w:type="dxa"/>
           <w:right w:w="10" w:type="dxa"/>
         </w:tblCellMar>
-        <w:tblLook w:val="0000" w:firstRow="0" w:lastRow="0" w:firstColumn="0" w:lastColumn="0" w:noHBand="0" w:noVBand="0"/>
+        <w:tblLook w:val="04A0" w:firstRow="1" w:lastRow="0" w:firstColumn="1" w:lastColumn="0" w:noHBand="0" w:noVBand="1"/>
       </w:tblPr>
       <w:tblGrid>
-        <w:gridCol w:w="3000"/>
-        <w:gridCol w:w="7435"/>
+        <w:gridCol w:w="2600"/>
+        <w:gridCol w:w="7655"/>
       </w:tblGrid>
       <w:tr>
-        <w:trPr>
-          <w:tblHeader/>
-        </w:trPr>
-        <w:tc>
-          <w:tcPr>
-            <w:tcW w:w="3000" w:type="dxa"/>
+        <w:tc>
+          <w:tcPr>
+            <w:tcW w:w="2600" w:type="dxa"/>
             <w:shd w:val="clear" w:color="auto" w:fill="2B231D"/>
             <w:tcMar>
               <w:top w:w="60" w:type="dxa"/>
@@ -67,25 +64,59 @@
               <w:bottom w:w="60" w:type="dxa"/>
               <w:right w:w="100" w:type="dxa"/>
             </w:tcMar>
-            <w:vAlign w:val="center"/>
-          </w:tcPr>
-          <w:p>
-            <w:r>
-              <w:rPr>
-                <w:rFonts w:cs="Calibri"/>
+          </w:tcPr>
+          <w:p>
+            <w:r>
+              <w:rPr>
                 <w:b/>
                 <w:bCs/>
                 <w:color w:val="FFFFFF"/>
                 <w:sz w:val="18"/>
                 <w:szCs w:val="18"/>
               </w:rPr>
-              <w:t>Field</w:t>
-            </w:r>
-          </w:p>
-        </w:tc>
-        <w:tc>
-          <w:tcPr>
-            <w:tcW w:w="7435" w:type="dxa"/>
+              <w:t>Meeting Date</w:t>
+            </w:r>
+          </w:p>
+        </w:tc>
+        <w:tc>
+          <w:tcPr>
+            <w:tcW w:w="7655" w:type="dxa"/>
+            <w:tcMar>
+              <w:top w:w="60" w:type="dxa"/>
+              <w:left w:w="100" w:type="dxa"/>
+              <w:bottom w:w="60" w:type="dxa"/>
+              <w:right w:w="100" w:type="dxa"/>
+            </w:tcMar>
+          </w:tcPr>
+          <w:p>
+            <w:r>
+              <w:rPr>
+                <w:sz w:val="18"/>
+                <w:szCs w:val="18"/>
+              </w:rPr>
+              <w:t>2</w:t>
+            </w:r>
+            <w:r>
+              <w:rPr>
+                <w:sz w:val="18"/>
+                <w:szCs w:val="18"/>
+              </w:rPr>
+              <w:t>0</w:t>
+            </w:r>
+            <w:r>
+              <w:rPr>
+                <w:sz w:val="18"/>
+                <w:szCs w:val="18"/>
+              </w:rPr>
+              <w:t xml:space="preserve"> September 2026</w:t>
+            </w:r>
+          </w:p>
+        </w:tc>
+      </w:tr>
+      <w:tr>
+        <w:tc>
+          <w:tcPr>
+            <w:tcW w:w="2600" w:type="dxa"/>
             <w:shd w:val="clear" w:color="auto" w:fill="2B231D"/>
             <w:tcMar>
               <w:top w:w="60" w:type="dxa"/>
@@ -93,19 +124,45 @@
               <w:bottom w:w="60" w:type="dxa"/>
               <w:right w:w="100" w:type="dxa"/>
             </w:tcMar>
-            <w:vAlign w:val="center"/>
-          </w:tcPr>
-          <w:p>
-            <w:r>
-              <w:rPr>
-                <w:rFonts w:cs="Calibri"/>
+          </w:tcPr>
+          <w:p>
+            <w:r>
+              <w:rPr>
                 <w:b/>
                 <w:bCs/>
                 <w:color w:val="FFFFFF"/>
                 <w:sz w:val="18"/>
                 <w:szCs w:val="18"/>
               </w:rPr>
-              <w:t>Details</w:t>
+              <w:t>Meeting Number</w:t>
+            </w:r>
+          </w:p>
+        </w:tc>
+        <w:tc>
+          <w:tcPr>
+            <w:tcW w:w="7655" w:type="dxa"/>
+            <w:shd w:val="clear" w:color="auto" w:fill="E7E1D8"/>
+            <w:tcMar>
+              <w:top w:w="60" w:type="dxa"/>
+              <w:left w:w="100" w:type="dxa"/>
+              <w:bottom w:w="60" w:type="dxa"/>
+              <w:right w:w="100" w:type="dxa"/>
+            </w:tcMar>
+          </w:tcPr>
+          <w:p>
+            <w:r>
+              <w:rPr>
+                <w:sz w:val="18"/>
+                <w:szCs w:val="18"/>
+              </w:rPr>
+              <w:t>0</w:t>
+            </w:r>
+            <w:r>
+              <w:rPr>
+                <w:sz w:val="18"/>
+                <w:szCs w:val="18"/>
+              </w:rPr>
+              <w:t>1</w:t>
             </w:r>
           </w:p>
         </w:tc>
@@ -113,45 +170,52 @@
       <w:tr>
         <w:tc>
           <w:tcPr>
-            <w:tcW w:w="3000" w:type="dxa"/>
-            <w:tcMar>
-              <w:top w:w="60" w:type="dxa"/>
-              <w:left w:w="100" w:type="dxa"/>
-              <w:bottom w:w="60" w:type="dxa"/>
-              <w:right w:w="100" w:type="dxa"/>
-            </w:tcMar>
-            <w:vAlign w:val="center"/>
-          </w:tcPr>
-          <w:p>
-            <w:r>
-              <w:rPr>
-                <w:rFonts w:cs="Calibri"/>
-                <w:sz w:val="18"/>
-                <w:szCs w:val="18"/>
-              </w:rPr>
-              <w:t>Meeting Date</w:t>
-            </w:r>
-          </w:p>
-        </w:tc>
-        <w:tc>
-          <w:tcPr>
-            <w:tcW w:w="7435" w:type="dxa"/>
-            <w:tcMar>
-              <w:top w:w="60" w:type="dxa"/>
-              <w:left w:w="100" w:type="dxa"/>
-              <w:bottom w:w="60" w:type="dxa"/>
-              <w:right w:w="100" w:type="dxa"/>
-            </w:tcMar>
-            <w:vAlign w:val="center"/>
-          </w:tcPr>
-          <w:p>
-            <w:r>
-              <w:rPr>
-                <w:rFonts w:cs="Calibri"/>
-                <w:sz w:val="18"/>
-                <w:szCs w:val="18"/>
-              </w:rPr>
-              <w:t>20 September 2026</w:t>
+            <w:tcW w:w="2600" w:type="dxa"/>
+            <w:shd w:val="clear" w:color="auto" w:fill="2B231D"/>
+            <w:tcMar>
+              <w:top w:w="60" w:type="dxa"/>
+              <w:left w:w="100" w:type="dxa"/>
+              <w:bottom w:w="60" w:type="dxa"/>
+              <w:right w:w="100" w:type="dxa"/>
+            </w:tcMar>
+          </w:tcPr>
+          <w:p>
+            <w:r>
+              <w:rPr>
+                <w:b/>
+                <w:bCs/>
+                <w:color w:val="FFFFFF"/>
+                <w:sz w:val="18"/>
+                <w:szCs w:val="18"/>
+              </w:rPr>
+              <w:t>Week</w:t>
+            </w:r>
+          </w:p>
+        </w:tc>
+        <w:tc>
+          <w:tcPr>
+            <w:tcW w:w="7655" w:type="dxa"/>
+            <w:tcMar>
+              <w:top w:w="60" w:type="dxa"/>
+              <w:left w:w="100" w:type="dxa"/>
+              <w:bottom w:w="60" w:type="dxa"/>
+              <w:right w:w="100" w:type="dxa"/>
+            </w:tcMar>
+          </w:tcPr>
+          <w:p>
+            <w:r>
+              <w:rPr>
+                <w:sz w:val="18"/>
+                <w:szCs w:val="18"/>
+              </w:rPr>
+              <w:t>Week 0</w:t>
+            </w:r>
+            <w:r>
+              <w:rPr>
+                <w:sz w:val="18"/>
+                <w:szCs w:val="18"/>
+              </w:rPr>
+              <w:t>1</w:t>
             </w:r>
           </w:p>
         </w:tc>
@@ -159,7 +223,31 @@
       <w:tr>
         <w:tc>
           <w:tcPr>
-            <w:tcW w:w="3000" w:type="dxa"/>
+            <w:tcW w:w="2600" w:type="dxa"/>
+            <w:shd w:val="clear" w:color="auto" w:fill="2B231D"/>
+            <w:tcMar>
+              <w:top w:w="60" w:type="dxa"/>
+              <w:left w:w="100" w:type="dxa"/>
+              <w:bottom w:w="60" w:type="dxa"/>
+              <w:right w:w="100" w:type="dxa"/>
+            </w:tcMar>
+          </w:tcPr>
+          <w:p>
+            <w:r>
+              <w:rPr>
+                <w:b/>
+                <w:bCs/>
+                <w:color w:val="FFFFFF"/>
+                <w:sz w:val="18"/>
+                <w:szCs w:val="18"/>
+              </w:rPr>
+              <w:t>Meeting Type</w:t>
+            </w:r>
+          </w:p>
+        </w:tc>
+        <w:tc>
+          <w:tcPr>
+            <w:tcW w:w="7655" w:type="dxa"/>
             <w:shd w:val="clear" w:color="auto" w:fill="E7E1D8"/>
             <w:tcMar>
               <w:top w:w="60" w:type="dxa"/>
@@ -167,39 +255,14 @@
               <w:bottom w:w="60" w:type="dxa"/>
               <w:right w:w="100" w:type="dxa"/>
             </w:tcMar>
-            <w:vAlign w:val="center"/>
-          </w:tcPr>
-          <w:p>
-            <w:r>
-              <w:rPr>
-                <w:rFonts w:cs="Calibri"/>
-                <w:sz w:val="18"/>
-                <w:szCs w:val="18"/>
-              </w:rPr>
-              <w:t>Meeting Number</w:t>
-            </w:r>
-          </w:p>
-        </w:tc>
-        <w:tc>
-          <w:tcPr>
-            <w:tcW w:w="7435" w:type="dxa"/>
-            <w:shd w:val="clear" w:color="auto" w:fill="E7E1D8"/>
-            <w:tcMar>
-              <w:top w:w="60" w:type="dxa"/>
-              <w:left w:w="100" w:type="dxa"/>
-              <w:bottom w:w="60" w:type="dxa"/>
-              <w:right w:w="100" w:type="dxa"/>
-            </w:tcMar>
-            <w:vAlign w:val="center"/>
-          </w:tcPr>
-          <w:p>
-            <w:r>
-              <w:rPr>
-                <w:rFonts w:cs="Calibri"/>
-                <w:sz w:val="18"/>
-                <w:szCs w:val="18"/>
-              </w:rPr>
-              <w:t>01</w:t>
+          </w:tcPr>
+          <w:p>
+            <w:r>
+              <w:rPr>
+                <w:sz w:val="18"/>
+                <w:szCs w:val="18"/>
+              </w:rPr>
+              <w:t>Sprint Planning &amp; Progress Review</w:t>
             </w:r>
           </w:p>
         </w:tc>
@@ -207,45 +270,45 @@
       <w:tr>
         <w:tc>
           <w:tcPr>
-            <w:tcW w:w="3000" w:type="dxa"/>
-            <w:tcMar>
-              <w:top w:w="60" w:type="dxa"/>
-              <w:left w:w="100" w:type="dxa"/>
-              <w:bottom w:w="60" w:type="dxa"/>
-              <w:right w:w="100" w:type="dxa"/>
-            </w:tcMar>
-            <w:vAlign w:val="center"/>
-          </w:tcPr>
-          <w:p>
-            <w:r>
-              <w:rPr>
-                <w:rFonts w:cs="Calibri"/>
-                <w:sz w:val="18"/>
-                <w:szCs w:val="18"/>
-              </w:rPr>
-              <w:t>Week</w:t>
-            </w:r>
-          </w:p>
-        </w:tc>
-        <w:tc>
-          <w:tcPr>
-            <w:tcW w:w="7435" w:type="dxa"/>
-            <w:tcMar>
-              <w:top w:w="60" w:type="dxa"/>
-              <w:left w:w="100" w:type="dxa"/>
-              <w:bottom w:w="60" w:type="dxa"/>
-              <w:right w:w="100" w:type="dxa"/>
-            </w:tcMar>
-            <w:vAlign w:val="center"/>
-          </w:tcPr>
-          <w:p>
-            <w:r>
-              <w:rPr>
-                <w:rFonts w:cs="Calibri"/>
-                <w:sz w:val="18"/>
-                <w:szCs w:val="18"/>
-              </w:rPr>
-              <w:t>Week 01</w:t>
+            <w:tcW w:w="2600" w:type="dxa"/>
+            <w:shd w:val="clear" w:color="auto" w:fill="2B231D"/>
+            <w:tcMar>
+              <w:top w:w="60" w:type="dxa"/>
+              <w:left w:w="100" w:type="dxa"/>
+              <w:bottom w:w="60" w:type="dxa"/>
+              <w:right w:w="100" w:type="dxa"/>
+            </w:tcMar>
+          </w:tcPr>
+          <w:p>
+            <w:r>
+              <w:rPr>
+                <w:b/>
+                <w:bCs/>
+                <w:color w:val="FFFFFF"/>
+                <w:sz w:val="18"/>
+                <w:szCs w:val="18"/>
+              </w:rPr>
+              <w:t>Project Management Tool</w:t>
+            </w:r>
+          </w:p>
+        </w:tc>
+        <w:tc>
+          <w:tcPr>
+            <w:tcW w:w="7655" w:type="dxa"/>
+            <w:tcMar>
+              <w:top w:w="60" w:type="dxa"/>
+              <w:left w:w="100" w:type="dxa"/>
+              <w:bottom w:w="60" w:type="dxa"/>
+              <w:right w:w="100" w:type="dxa"/>
+            </w:tcMar>
+          </w:tcPr>
+          <w:p>
+            <w:r>
+              <w:rPr>
+                <w:sz w:val="18"/>
+                <w:szCs w:val="18"/>
+              </w:rPr>
+              <w:t>Trello</w:t>
             </w:r>
           </w:p>
         </w:tc>
@@ -253,7 +316,31 @@
       <w:tr>
         <w:tc>
           <w:tcPr>
-            <w:tcW w:w="3000" w:type="dxa"/>
+            <w:tcW w:w="2600" w:type="dxa"/>
+            <w:shd w:val="clear" w:color="auto" w:fill="2B231D"/>
+            <w:tcMar>
+              <w:top w:w="60" w:type="dxa"/>
+              <w:left w:w="100" w:type="dxa"/>
+              <w:bottom w:w="60" w:type="dxa"/>
+              <w:right w:w="100" w:type="dxa"/>
+            </w:tcMar>
+          </w:tcPr>
+          <w:p>
+            <w:r>
+              <w:rPr>
+                <w:b/>
+                <w:bCs/>
+                <w:color w:val="FFFFFF"/>
+                <w:sz w:val="18"/>
+                <w:szCs w:val="18"/>
+              </w:rPr>
+              <w:t>Development Approach</w:t>
+            </w:r>
+          </w:p>
+        </w:tc>
+        <w:tc>
+          <w:tcPr>
+            <w:tcW w:w="7655" w:type="dxa"/>
             <w:shd w:val="clear" w:color="auto" w:fill="E7E1D8"/>
             <w:tcMar>
               <w:top w:w="60" w:type="dxa"/>
@@ -261,39 +348,14 @@
               <w:bottom w:w="60" w:type="dxa"/>
               <w:right w:w="100" w:type="dxa"/>
             </w:tcMar>
-            <w:vAlign w:val="center"/>
-          </w:tcPr>
-          <w:p>
-            <w:r>
-              <w:rPr>
-                <w:rFonts w:cs="Calibri"/>
-                <w:sz w:val="18"/>
-                <w:szCs w:val="18"/>
-              </w:rPr>
-              <w:t>Meeting Type</w:t>
-            </w:r>
-          </w:p>
-        </w:tc>
-        <w:tc>
-          <w:tcPr>
-            <w:tcW w:w="7435" w:type="dxa"/>
-            <w:shd w:val="clear" w:color="auto" w:fill="E7E1D8"/>
-            <w:tcMar>
-              <w:top w:w="60" w:type="dxa"/>
-              <w:left w:w="100" w:type="dxa"/>
-              <w:bottom w:w="60" w:type="dxa"/>
-              <w:right w:w="100" w:type="dxa"/>
-            </w:tcMar>
-            <w:vAlign w:val="center"/>
-          </w:tcPr>
-          <w:p>
-            <w:r>
-              <w:rPr>
-                <w:rFonts w:cs="Calibri"/>
-                <w:sz w:val="18"/>
-                <w:szCs w:val="18"/>
-              </w:rPr>
-              <w:t>Initial Team Meeting</w:t>
+          </w:tcPr>
+          <w:p>
+            <w:r>
+              <w:rPr>
+                <w:sz w:val="18"/>
+                <w:szCs w:val="18"/>
+              </w:rPr>
+              <w:t>Scrum / Agile</w:t>
             </w:r>
           </w:p>
         </w:tc>
@@ -301,113 +363,21 @@
       <w:tr>
         <w:tc>
           <w:tcPr>
-            <w:tcW w:w="3000" w:type="dxa"/>
-            <w:tcMar>
-              <w:top w:w="60" w:type="dxa"/>
-              <w:left w:w="100" w:type="dxa"/>
-              <w:bottom w:w="60" w:type="dxa"/>
-              <w:right w:w="100" w:type="dxa"/>
-            </w:tcMar>
-            <w:vAlign w:val="center"/>
-          </w:tcPr>
-          <w:p>
-            <w:r>
-              <w:rPr>
-                <w:rFonts w:cs="Calibri"/>
-                <w:sz w:val="18"/>
-                <w:szCs w:val="18"/>
-              </w:rPr>
-              <w:t>Project Management Tool</w:t>
-            </w:r>
-          </w:p>
-        </w:tc>
-        <w:tc>
-          <w:tcPr>
-            <w:tcW w:w="7435" w:type="dxa"/>
-            <w:tcMar>
-              <w:top w:w="60" w:type="dxa"/>
-              <w:left w:w="100" w:type="dxa"/>
-              <w:bottom w:w="60" w:type="dxa"/>
-              <w:right w:w="100" w:type="dxa"/>
-            </w:tcMar>
-            <w:vAlign w:val="center"/>
-          </w:tcPr>
-          <w:p>
-            <w:r>
-              <w:rPr>
-                <w:rFonts w:cs="Calibri"/>
-                <w:sz w:val="18"/>
-                <w:szCs w:val="18"/>
-              </w:rPr>
-              <w:t>Trello</w:t>
-            </w:r>
-          </w:p>
-        </w:tc>
-      </w:tr>
-      <w:tr>
-        <w:tc>
-          <w:tcPr>
-            <w:tcW w:w="3000" w:type="dxa"/>
-            <w:shd w:val="clear" w:color="auto" w:fill="E7E1D8"/>
-            <w:tcMar>
-              <w:top w:w="60" w:type="dxa"/>
-              <w:left w:w="100" w:type="dxa"/>
-              <w:bottom w:w="60" w:type="dxa"/>
-              <w:right w:w="100" w:type="dxa"/>
-            </w:tcMar>
-            <w:vAlign w:val="center"/>
-          </w:tcPr>
-          <w:p>
-            <w:r>
-              <w:rPr>
-                <w:rFonts w:cs="Calibri"/>
-                <w:sz w:val="18"/>
-                <w:szCs w:val="18"/>
-              </w:rPr>
-              <w:t>Development Approach</w:t>
-            </w:r>
-          </w:p>
-        </w:tc>
-        <w:tc>
-          <w:tcPr>
-            <w:tcW w:w="7435" w:type="dxa"/>
-            <w:shd w:val="clear" w:color="auto" w:fill="E7E1D8"/>
-            <w:tcMar>
-              <w:top w:w="60" w:type="dxa"/>
-              <w:left w:w="100" w:type="dxa"/>
-              <w:bottom w:w="60" w:type="dxa"/>
-              <w:right w:w="100" w:type="dxa"/>
-            </w:tcMar>
-            <w:vAlign w:val="center"/>
-          </w:tcPr>
-          <w:p>
-            <w:r>
-              <w:rPr>
-                <w:rFonts w:cs="Calibri"/>
-                <w:sz w:val="18"/>
-                <w:szCs w:val="18"/>
-              </w:rPr>
-              <w:t>Scrum / Agile</w:t>
-            </w:r>
-          </w:p>
-        </w:tc>
-      </w:tr>
-      <w:tr>
-        <w:tc>
-          <w:tcPr>
-            <w:tcW w:w="3000" w:type="dxa"/>
-            <w:tcMar>
-              <w:top w:w="60" w:type="dxa"/>
-              <w:left w:w="100" w:type="dxa"/>
-              <w:bottom w:w="60" w:type="dxa"/>
-              <w:right w:w="100" w:type="dxa"/>
-            </w:tcMar>
-            <w:vAlign w:val="center"/>
-          </w:tcPr>
-          <w:p>
-            <w:r>
-              <w:rPr>
-                <w:rFonts w:cs="Calibri"/>
+            <w:tcW w:w="2600" w:type="dxa"/>
+            <w:shd w:val="clear" w:color="auto" w:fill="2B231D"/>
+            <w:tcMar>
+              <w:top w:w="60" w:type="dxa"/>
+              <w:left w:w="100" w:type="dxa"/>
+              <w:bottom w:w="60" w:type="dxa"/>
+              <w:right w:w="100" w:type="dxa"/>
+            </w:tcMar>
+          </w:tcPr>
+          <w:p>
+            <w:r>
+              <w:rPr>
+                <w:b/>
+                <w:bCs/>
+                <w:color w:val="FFFFFF"/>
                 <w:sz w:val="18"/>
                 <w:szCs w:val="18"/>
               </w:rPr>
@@ -417,19 +387,17 @@
         </w:tc>
         <w:tc>
           <w:tcPr>
-            <w:tcW w:w="7435" w:type="dxa"/>
-            <w:tcMar>
-              <w:top w:w="60" w:type="dxa"/>
-              <w:left w:w="100" w:type="dxa"/>
-              <w:bottom w:w="60" w:type="dxa"/>
-              <w:right w:w="100" w:type="dxa"/>
-            </w:tcMar>
-            <w:vAlign w:val="center"/>
-          </w:tcPr>
-          <w:p>
-            <w:r>
-              <w:rPr>
-                <w:rFonts w:cs="Calibri"/>
+            <w:tcW w:w="7655" w:type="dxa"/>
+            <w:tcMar>
+              <w:top w:w="60" w:type="dxa"/>
+              <w:left w:w="100" w:type="dxa"/>
+              <w:bottom w:w="60" w:type="dxa"/>
+              <w:right w:w="100" w:type="dxa"/>
+            </w:tcMar>
+          </w:tcPr>
+          <w:p>
+            <w:r>
+              <w:rPr>
                 <w:sz w:val="18"/>
                 <w:szCs w:val="18"/>
               </w:rPr>
@@ -1174,6 +1142,25 @@
       </w:pPr>
       <w:r>
         <w:t>Sprint 5 / Finalization – final fixes and documentation, if required.</w:t>
+      </w:r>
+    </w:p>
+    <w:p>
+      <w:pPr>
+        <w:pStyle w:val="ListParagraph"/>
+        <w:numPr>
+          <w:ilvl w:val="0"/>
+          <w:numId w:val="1"/>
+        </w:numPr>
+        <w:spacing w:after="80"/>
+      </w:pPr>
+      <w:r>
+        <w:t>To Do</w:t>
+      </w:r>
+      <w:r>
+        <w:t xml:space="preserve"> – tasks that </w:t>
+      </w:r>
+      <w:r>
+        <w:t>will be starts working on.</w:t>
       </w:r>
     </w:p>
     <w:p>
@@ -1479,23 +1466,28 @@
         <w:tc>
           <w:tcPr>
             <w:tcW w:w="1104" w:type="dxa"/>
-            <w:shd w:val="clear" w:color="auto" w:fill="C1F0C7"/>
-            <w:tcMar>
-              <w:top w:w="60" w:type="dxa"/>
-              <w:left w:w="100" w:type="dxa"/>
-              <w:bottom w:w="60" w:type="dxa"/>
-              <w:right w:w="100" w:type="dxa"/>
-            </w:tcMar>
-            <w:vAlign w:val="center"/>
-          </w:tcPr>
-          <w:p>
-            <w:r>
-              <w:rPr>
-                <w:rFonts w:cs="Calibri"/>
-                <w:sz w:val="18"/>
-                <w:szCs w:val="18"/>
-              </w:rPr>
-              <w:t>Done</w:t>
+            <w:shd w:val="clear" w:color="auto" w:fill="ADADAD" w:themeFill="background2" w:themeFillShade="BF"/>
+            <w:tcMar>
+              <w:top w:w="60" w:type="dxa"/>
+              <w:left w:w="100" w:type="dxa"/>
+              <w:bottom w:w="60" w:type="dxa"/>
+              <w:right w:w="100" w:type="dxa"/>
+            </w:tcMar>
+            <w:vAlign w:val="center"/>
+          </w:tcPr>
+          <w:p>
+            <w:pPr>
+              <w:rPr>
+                <w:sz w:val="18"/>
+                <w:szCs w:val="17"/>
+              </w:rPr>
+            </w:pPr>
+            <w:r>
+              <w:rPr>
+                <w:sz w:val="18"/>
+                <w:szCs w:val="17"/>
+              </w:rPr>
+              <w:t>To do</w:t>
             </w:r>
           </w:p>
         </w:tc>
@@ -1599,23 +1591,28 @@
         <w:tc>
           <w:tcPr>
             <w:tcW w:w="1104" w:type="dxa"/>
-            <w:shd w:val="clear" w:color="auto" w:fill="C1F0C7"/>
-            <w:tcMar>
-              <w:top w:w="60" w:type="dxa"/>
-              <w:left w:w="100" w:type="dxa"/>
-              <w:bottom w:w="60" w:type="dxa"/>
-              <w:right w:w="100" w:type="dxa"/>
-            </w:tcMar>
-            <w:vAlign w:val="center"/>
-          </w:tcPr>
-          <w:p>
-            <w:r>
-              <w:rPr>
-                <w:rFonts w:cs="Calibri"/>
-                <w:sz w:val="18"/>
-                <w:szCs w:val="18"/>
-              </w:rPr>
-              <w:t>Done</w:t>
+            <w:shd w:val="clear" w:color="auto" w:fill="ADADAD" w:themeFill="background2" w:themeFillShade="BF"/>
+            <w:tcMar>
+              <w:top w:w="60" w:type="dxa"/>
+              <w:left w:w="100" w:type="dxa"/>
+              <w:bottom w:w="60" w:type="dxa"/>
+              <w:right w:w="100" w:type="dxa"/>
+            </w:tcMar>
+            <w:vAlign w:val="center"/>
+          </w:tcPr>
+          <w:p>
+            <w:pPr>
+              <w:rPr>
+                <w:sz w:val="18"/>
+                <w:szCs w:val="17"/>
+              </w:rPr>
+            </w:pPr>
+            <w:r>
+              <w:rPr>
+                <w:sz w:val="18"/>
+                <w:szCs w:val="17"/>
+              </w:rPr>
+              <w:t>To do</w:t>
             </w:r>
           </w:p>
         </w:tc>
@@ -1715,23 +1712,28 @@
         <w:tc>
           <w:tcPr>
             <w:tcW w:w="1104" w:type="dxa"/>
-            <w:shd w:val="clear" w:color="auto" w:fill="C1F0C7"/>
-            <w:tcMar>
-              <w:top w:w="60" w:type="dxa"/>
-              <w:left w:w="100" w:type="dxa"/>
-              <w:bottom w:w="60" w:type="dxa"/>
-              <w:right w:w="100" w:type="dxa"/>
-            </w:tcMar>
-            <w:vAlign w:val="center"/>
-          </w:tcPr>
-          <w:p>
-            <w:r>
-              <w:rPr>
-                <w:rFonts w:cs="Calibri"/>
-                <w:sz w:val="18"/>
-                <w:szCs w:val="18"/>
-              </w:rPr>
-              <w:t>Done</w:t>
+            <w:shd w:val="clear" w:color="auto" w:fill="ADADAD" w:themeFill="background2" w:themeFillShade="BF"/>
+            <w:tcMar>
+              <w:top w:w="60" w:type="dxa"/>
+              <w:left w:w="100" w:type="dxa"/>
+              <w:bottom w:w="60" w:type="dxa"/>
+              <w:right w:w="100" w:type="dxa"/>
+            </w:tcMar>
+            <w:vAlign w:val="center"/>
+          </w:tcPr>
+          <w:p>
+            <w:pPr>
+              <w:rPr>
+                <w:sz w:val="18"/>
+                <w:szCs w:val="17"/>
+              </w:rPr>
+            </w:pPr>
+            <w:r>
+              <w:rPr>
+                <w:sz w:val="18"/>
+                <w:szCs w:val="17"/>
+              </w:rPr>
+              <w:t>To do</w:t>
             </w:r>
           </w:p>
         </w:tc>
@@ -1782,15 +1784,7 @@
                 <w:sz w:val="18"/>
                 <w:szCs w:val="18"/>
               </w:rPr>
-              <w:t>Analyse</w:t>
-            </w:r>
-            <w:r>
-              <w:rPr>
-                <w:rFonts w:cs="Calibri"/>
-                <w:sz w:val="18"/>
-                <w:szCs w:val="18"/>
-              </w:rPr>
-              <w:t xml:space="preserve"> dataset and variables</w:t>
+              <w:t>Analyse dataset and variables</w:t>
             </w:r>
           </w:p>
         </w:tc>
@@ -1843,23 +1837,28 @@
         <w:tc>
           <w:tcPr>
             <w:tcW w:w="1104" w:type="dxa"/>
-            <w:shd w:val="clear" w:color="auto" w:fill="C1F0C7"/>
-            <w:tcMar>
-              <w:top w:w="60" w:type="dxa"/>
-              <w:left w:w="100" w:type="dxa"/>
-              <w:bottom w:w="60" w:type="dxa"/>
-              <w:right w:w="100" w:type="dxa"/>
-            </w:tcMar>
-            <w:vAlign w:val="center"/>
-          </w:tcPr>
-          <w:p>
-            <w:r>
-              <w:rPr>
-                <w:rFonts w:cs="Calibri"/>
-                <w:sz w:val="18"/>
-                <w:szCs w:val="18"/>
-              </w:rPr>
-              <w:t>Done</w:t>
+            <w:shd w:val="clear" w:color="auto" w:fill="ADADAD" w:themeFill="background2" w:themeFillShade="BF"/>
+            <w:tcMar>
+              <w:top w:w="60" w:type="dxa"/>
+              <w:left w:w="100" w:type="dxa"/>
+              <w:bottom w:w="60" w:type="dxa"/>
+              <w:right w:w="100" w:type="dxa"/>
+            </w:tcMar>
+            <w:vAlign w:val="center"/>
+          </w:tcPr>
+          <w:p>
+            <w:pPr>
+              <w:rPr>
+                <w:sz w:val="18"/>
+                <w:szCs w:val="17"/>
+              </w:rPr>
+            </w:pPr>
+            <w:r>
+              <w:rPr>
+                <w:sz w:val="18"/>
+                <w:szCs w:val="17"/>
+              </w:rPr>
+              <w:t>To do</w:t>
             </w:r>
           </w:p>
         </w:tc>
@@ -1959,23 +1958,28 @@
         <w:tc>
           <w:tcPr>
             <w:tcW w:w="1104" w:type="dxa"/>
-            <w:shd w:val="clear" w:color="auto" w:fill="C1F0C7"/>
-            <w:tcMar>
-              <w:top w:w="60" w:type="dxa"/>
-              <w:left w:w="100" w:type="dxa"/>
-              <w:bottom w:w="60" w:type="dxa"/>
-              <w:right w:w="100" w:type="dxa"/>
-            </w:tcMar>
-            <w:vAlign w:val="center"/>
-          </w:tcPr>
-          <w:p>
-            <w:r>
-              <w:rPr>
-                <w:rFonts w:cs="Calibri"/>
-                <w:sz w:val="18"/>
-                <w:szCs w:val="18"/>
-              </w:rPr>
-              <w:t>Done</w:t>
+            <w:shd w:val="clear" w:color="auto" w:fill="ADADAD" w:themeFill="background2" w:themeFillShade="BF"/>
+            <w:tcMar>
+              <w:top w:w="60" w:type="dxa"/>
+              <w:left w:w="100" w:type="dxa"/>
+              <w:bottom w:w="60" w:type="dxa"/>
+              <w:right w:w="100" w:type="dxa"/>
+            </w:tcMar>
+            <w:vAlign w:val="center"/>
+          </w:tcPr>
+          <w:p>
+            <w:pPr>
+              <w:rPr>
+                <w:sz w:val="18"/>
+                <w:szCs w:val="17"/>
+              </w:rPr>
+            </w:pPr>
+            <w:r>
+              <w:rPr>
+                <w:sz w:val="18"/>
+                <w:szCs w:val="17"/>
+              </w:rPr>
+              <w:t>To do</w:t>
             </w:r>
           </w:p>
         </w:tc>
@@ -2079,23 +2083,28 @@
         <w:tc>
           <w:tcPr>
             <w:tcW w:w="1104" w:type="dxa"/>
-            <w:shd w:val="clear" w:color="auto" w:fill="C1F0C7"/>
-            <w:tcMar>
-              <w:top w:w="60" w:type="dxa"/>
-              <w:left w:w="100" w:type="dxa"/>
-              <w:bottom w:w="60" w:type="dxa"/>
-              <w:right w:w="100" w:type="dxa"/>
-            </w:tcMar>
-            <w:vAlign w:val="center"/>
-          </w:tcPr>
-          <w:p>
-            <w:r>
-              <w:rPr>
-                <w:rFonts w:cs="Calibri"/>
-                <w:sz w:val="18"/>
-                <w:szCs w:val="18"/>
-              </w:rPr>
-              <w:t>Done</w:t>
+            <w:shd w:val="clear" w:color="auto" w:fill="ADADAD" w:themeFill="background2" w:themeFillShade="BF"/>
+            <w:tcMar>
+              <w:top w:w="60" w:type="dxa"/>
+              <w:left w:w="100" w:type="dxa"/>
+              <w:bottom w:w="60" w:type="dxa"/>
+              <w:right w:w="100" w:type="dxa"/>
+            </w:tcMar>
+            <w:vAlign w:val="center"/>
+          </w:tcPr>
+          <w:p>
+            <w:pPr>
+              <w:rPr>
+                <w:sz w:val="18"/>
+                <w:szCs w:val="17"/>
+              </w:rPr>
+            </w:pPr>
+            <w:r>
+              <w:rPr>
+                <w:sz w:val="18"/>
+                <w:szCs w:val="17"/>
+              </w:rPr>
+              <w:t>To do</w:t>
             </w:r>
           </w:p>
         </w:tc>
@@ -2195,23 +2204,28 @@
         <w:tc>
           <w:tcPr>
             <w:tcW w:w="1104" w:type="dxa"/>
-            <w:shd w:val="clear" w:color="auto" w:fill="C1F0C7"/>
-            <w:tcMar>
-              <w:top w:w="60" w:type="dxa"/>
-              <w:left w:w="100" w:type="dxa"/>
-              <w:bottom w:w="60" w:type="dxa"/>
-              <w:right w:w="100" w:type="dxa"/>
-            </w:tcMar>
-            <w:vAlign w:val="center"/>
-          </w:tcPr>
-          <w:p>
-            <w:r>
-              <w:rPr>
-                <w:rFonts w:cs="Calibri"/>
-                <w:sz w:val="18"/>
-                <w:szCs w:val="18"/>
-              </w:rPr>
-              <w:t>Done</w:t>
+            <w:shd w:val="clear" w:color="auto" w:fill="ADADAD" w:themeFill="background2" w:themeFillShade="BF"/>
+            <w:tcMar>
+              <w:top w:w="60" w:type="dxa"/>
+              <w:left w:w="100" w:type="dxa"/>
+              <w:bottom w:w="60" w:type="dxa"/>
+              <w:right w:w="100" w:type="dxa"/>
+            </w:tcMar>
+            <w:vAlign w:val="center"/>
+          </w:tcPr>
+          <w:p>
+            <w:pPr>
+              <w:rPr>
+                <w:sz w:val="18"/>
+                <w:szCs w:val="17"/>
+              </w:rPr>
+            </w:pPr>
+            <w:r>
+              <w:rPr>
+                <w:sz w:val="18"/>
+                <w:szCs w:val="17"/>
+              </w:rPr>
+              <w:t>To do</w:t>
             </w:r>
           </w:p>
         </w:tc>
@@ -2315,23 +2329,28 @@
         <w:tc>
           <w:tcPr>
             <w:tcW w:w="1104" w:type="dxa"/>
-            <w:shd w:val="clear" w:color="auto" w:fill="C1F0C7"/>
-            <w:tcMar>
-              <w:top w:w="60" w:type="dxa"/>
-              <w:left w:w="100" w:type="dxa"/>
-              <w:bottom w:w="60" w:type="dxa"/>
-              <w:right w:w="100" w:type="dxa"/>
-            </w:tcMar>
-            <w:vAlign w:val="center"/>
-          </w:tcPr>
-          <w:p>
-            <w:r>
-              <w:rPr>
-                <w:rFonts w:cs="Calibri"/>
-                <w:sz w:val="18"/>
-                <w:szCs w:val="18"/>
-              </w:rPr>
-              <w:t>Done</w:t>
+            <w:shd w:val="clear" w:color="auto" w:fill="ADADAD" w:themeFill="background2" w:themeFillShade="BF"/>
+            <w:tcMar>
+              <w:top w:w="60" w:type="dxa"/>
+              <w:left w:w="100" w:type="dxa"/>
+              <w:bottom w:w="60" w:type="dxa"/>
+              <w:right w:w="100" w:type="dxa"/>
+            </w:tcMar>
+            <w:vAlign w:val="center"/>
+          </w:tcPr>
+          <w:p>
+            <w:pPr>
+              <w:rPr>
+                <w:sz w:val="18"/>
+                <w:szCs w:val="17"/>
+              </w:rPr>
+            </w:pPr>
+            <w:r>
+              <w:rPr>
+                <w:sz w:val="18"/>
+                <w:szCs w:val="17"/>
+              </w:rPr>
+              <w:t>To do</w:t>
             </w:r>
           </w:p>
         </w:tc>
@@ -2431,23 +2450,28 @@
         <w:tc>
           <w:tcPr>
             <w:tcW w:w="1104" w:type="dxa"/>
-            <w:shd w:val="clear" w:color="auto" w:fill="C1F0C7"/>
-            <w:tcMar>
-              <w:top w:w="60" w:type="dxa"/>
-              <w:left w:w="100" w:type="dxa"/>
-              <w:bottom w:w="60" w:type="dxa"/>
-              <w:right w:w="100" w:type="dxa"/>
-            </w:tcMar>
-            <w:vAlign w:val="center"/>
-          </w:tcPr>
-          <w:p>
-            <w:r>
-              <w:rPr>
-                <w:rFonts w:cs="Calibri"/>
-                <w:sz w:val="18"/>
-                <w:szCs w:val="18"/>
-              </w:rPr>
-              <w:t>Done</w:t>
+            <w:shd w:val="clear" w:color="auto" w:fill="ADADAD" w:themeFill="background2" w:themeFillShade="BF"/>
+            <w:tcMar>
+              <w:top w:w="60" w:type="dxa"/>
+              <w:left w:w="100" w:type="dxa"/>
+              <w:bottom w:w="60" w:type="dxa"/>
+              <w:right w:w="100" w:type="dxa"/>
+            </w:tcMar>
+            <w:vAlign w:val="center"/>
+          </w:tcPr>
+          <w:p>
+            <w:pPr>
+              <w:rPr>
+                <w:sz w:val="18"/>
+                <w:szCs w:val="17"/>
+              </w:rPr>
+            </w:pPr>
+            <w:r>
+              <w:rPr>
+                <w:sz w:val="18"/>
+                <w:szCs w:val="17"/>
+              </w:rPr>
+              <w:t>To do</w:t>
             </w:r>
           </w:p>
         </w:tc>
@@ -2551,23 +2575,28 @@
         <w:tc>
           <w:tcPr>
             <w:tcW w:w="1104" w:type="dxa"/>
-            <w:shd w:val="clear" w:color="auto" w:fill="C1F0C7"/>
-            <w:tcMar>
-              <w:top w:w="60" w:type="dxa"/>
-              <w:left w:w="100" w:type="dxa"/>
-              <w:bottom w:w="60" w:type="dxa"/>
-              <w:right w:w="100" w:type="dxa"/>
-            </w:tcMar>
-            <w:vAlign w:val="center"/>
-          </w:tcPr>
-          <w:p>
-            <w:r>
-              <w:rPr>
-                <w:rFonts w:cs="Calibri"/>
-                <w:sz w:val="18"/>
-                <w:szCs w:val="18"/>
-              </w:rPr>
-              <w:t>Done</w:t>
+            <w:shd w:val="clear" w:color="auto" w:fill="ADADAD" w:themeFill="background2" w:themeFillShade="BF"/>
+            <w:tcMar>
+              <w:top w:w="60" w:type="dxa"/>
+              <w:left w:w="100" w:type="dxa"/>
+              <w:bottom w:w="60" w:type="dxa"/>
+              <w:right w:w="100" w:type="dxa"/>
+            </w:tcMar>
+            <w:vAlign w:val="center"/>
+          </w:tcPr>
+          <w:p>
+            <w:pPr>
+              <w:rPr>
+                <w:sz w:val="18"/>
+                <w:szCs w:val="17"/>
+              </w:rPr>
+            </w:pPr>
+            <w:r>
+              <w:rPr>
+                <w:sz w:val="18"/>
+                <w:szCs w:val="17"/>
+              </w:rPr>
+              <w:t>To do</w:t>
             </w:r>
           </w:p>
         </w:tc>
@@ -2922,6 +2951,7 @@
                 <w:sz w:val="18"/>
                 <w:szCs w:val="18"/>
               </w:rPr>
+              <w:lastRenderedPageBreak/>
               <w:t>Define 3 individual questions</w:t>
             </w:r>
           </w:p>
@@ -3013,7 +3043,6 @@
                 <w:sz w:val="18"/>
                 <w:szCs w:val="18"/>
               </w:rPr>
-              <w:lastRenderedPageBreak/>
               <w:t>Initial data analysis</w:t>
             </w:r>
           </w:p>
@@ -3995,7 +4024,31 @@
                 <w:sz w:val="18"/>
                 <w:szCs w:val="18"/>
               </w:rPr>
-              <w:t>Propose individual research questions</w:t>
+              <w:t>Propose</w:t>
+            </w:r>
+            <w:r>
+              <w:rPr>
+                <w:rFonts w:cs="Calibri"/>
+                <w:sz w:val="18"/>
+                <w:szCs w:val="18"/>
+              </w:rPr>
+              <w:t xml:space="preserve"> overarching </w:t>
+            </w:r>
+            <w:r>
+              <w:rPr>
+                <w:rFonts w:cs="Calibri"/>
+                <w:sz w:val="18"/>
+                <w:szCs w:val="18"/>
+              </w:rPr>
+              <w:t>research question and</w:t>
+            </w:r>
+            <w:r>
+              <w:rPr>
+                <w:rFonts w:cs="Calibri"/>
+                <w:sz w:val="18"/>
+                <w:szCs w:val="18"/>
+              </w:rPr>
+              <w:t xml:space="preserve"> individual research questions</w:t>
             </w:r>
           </w:p>
         </w:tc>
@@ -4260,21 +4313,7 @@
             <w:rStyle w:val="Hyperlink"/>
             <w:rFonts w:cs="Calibri"/>
           </w:rPr>
-          <w:t>Li</w:t>
-        </w:r>
-        <w:r>
-          <w:rPr>
-            <w:rStyle w:val="Hyperlink"/>
-            <w:rFonts w:cs="Calibri"/>
-          </w:rPr>
-          <w:t>n</w:t>
-        </w:r>
-        <w:r>
-          <w:rPr>
-            <w:rStyle w:val="Hyperlink"/>
-            <w:rFonts w:cs="Calibri"/>
-          </w:rPr>
-          <w:t>k</w:t>
+          <w:t>Link</w:t>
         </w:r>
       </w:hyperlink>
       <w:r>
@@ -4351,21 +4390,7 @@
             <w:rStyle w:val="Hyperlink"/>
             <w:rFonts w:cs="Calibri"/>
           </w:rPr>
-          <w:t>Li</w:t>
-        </w:r>
-        <w:r>
-          <w:rPr>
-            <w:rStyle w:val="Hyperlink"/>
-            <w:rFonts w:cs="Calibri"/>
-          </w:rPr>
-          <w:t>n</w:t>
-        </w:r>
-        <w:r>
-          <w:rPr>
-            <w:rStyle w:val="Hyperlink"/>
-            <w:rFonts w:cs="Calibri"/>
-          </w:rPr>
-          <w:t>k</w:t>
+          <w:t>Link</w:t>
         </w:r>
       </w:hyperlink>
     </w:p>
@@ -4437,16 +4462,7 @@
             <w:b/>
             <w:bCs/>
           </w:rPr>
-          <w:t>Lin</w:t>
-        </w:r>
-        <w:r>
-          <w:rPr>
-            <w:rStyle w:val="Hyperlink"/>
-            <w:rFonts w:cs="Calibri"/>
-            <w:b/>
-            <w:bCs/>
-          </w:rPr>
-          <w:t>k</w:t>
+          <w:t>Link</w:t>
         </w:r>
       </w:hyperlink>
     </w:p>

</xml_diff>